<commit_message>
Add WHO handover citation to AAC.2.f (transfer/referral)
Reuses the WHO Patient Safety Solutions handover citation already
verified for AAC.7 -- the written transfer summary AAC.2.f requires
is the same real-world act. AAC.1.c (scope of services) stays
untouched: no real external standard maps to it without stretching.

Co-Authored-By: Claude Sonnet 5 <noreply@anthropic.com>
Claude-Session: https://claude.ai/code/session_01TPRLtLhmTCP5z94Q3FiE5v
</commit_message>
<xml_diff>
--- a/policies/build/sop_record_masters/AAC/Records/AAC.2_Record_07_transfer_referral_log.docx
+++ b/policies/build/sop_record_masters/AAC/Records/AAC.2_Record_07_transfer_referral_log.docx
@@ -97,6 +97,26 @@
       </w:hyperlink>
       <w:r>
         <w:t>. Access, Assessment and Care of Patients chapter, standard AAC.2.</w:t>
+      </w:r>
+    </w:p>
+    <w:p>
+      <w:pPr>
+        <w:pStyle w:val="ListParagraph"/>
+      </w:pPr>
+      <w:r>
+        <w:t xml:space="preserve">World Health Organization. (2007). </w:t>
+      </w:r>
+      <w:hyperlink r:id="rId10">
+        <w:r>
+          <w:rPr>
+            <w:color w:val="0563C1"/>
+            <w:u w:val="single"/>
+          </w:rPr>
+          <w:t>Patient Safety Solutions, Volume 1, Solution 3: Communication During Patient Hand-Overs (May 2007)</w:t>
+        </w:r>
+      </w:hyperlink>
+      <w:r>
+        <w:t>. External benchmark only; not an NABH mandate.</w:t>
       </w:r>
     </w:p>
     <w:tbl>

</xml_diff>